<commit_message>
lc-balance-wc: microservice -- fix missing PRAGMA busy_timeout, record N+1 finding in DB optimization analysis
createDb() now sets busy_timeout=5000 on both the file and :memory: branches, closing the
Balance-Component-DB-Optimization-Analysis.md P0 gap (a second concurrent writer previously got
an immediate SQLITE_BUSY instead of the queuing Design doc SS6 describes as same-LC
serialization). New direct test confirms the PRAGMA readback on both branches.

Also records a new N+1 finding (out of the original analysis's stated scope) in
listCloseEligibleContracts()/evaluateContractCloseEligibility() -- up to ~800 queries per A10/B6
Close picker load at the 200-item cap -- documented only, not fixed, plus a missed third
parent_logical_contract_id call site. The .docx counterpart was regenerated and visually
verified (soffice/pdftoppm) to match.

Co-Authored-By: Claude Sonnet 5 <noreply@anthropic.com>
</commit_message>
<xml_diff>
--- a/lc-balance-wc/analysis/Balance-Component-DB-Optimization-Analysis.docx
+++ b/lc-balance-wc/analysis/Balance-Component-DB-Optimization-Analysis.docx
@@ -670,7 +670,7 @@
         <w:tc>
           <w:tcPr>
             <w:tcW w:type="pct" w:w="100%"/>
-            <w:shd w:fill="fef2f2" w:val="clear"/>
+            <w:shd w:fill="dcfce7" w:val="clear"/>
             <w:tcMar>
               <w:top w:type="dxa" w:w="60"/>
               <w:left w:type="dxa" w:w="120"/>
@@ -684,11 +684,11 @@
                 <w:rFonts w:ascii="Noto Sans CJK JP" w:cs="Noto Sans CJK JP" w:eastAsia="Noto Sans CJK JP" w:hAnsi="Noto Sans CJK JP"/>
                 <w:b/>
                 <w:bCs/>
-                <w:color w:val="b91c1c"/>
+                <w:color w:val="15803d"/>
                 <w:sz w:val="19"/>
                 <w:szCs w:val="19"/>
               </w:rPr>
-              <w:t xml:space="preserve">P0 · 立即可做，行為缺口明確</w:t>
+              <w:t xml:space="preserve">P0 · 已修復（2026-08-21）</w:t>
             </w:r>
           </w:p>
         </w:tc>
@@ -703,10 +703,22 @@
           <w:rFonts w:ascii="Noto Sans CJK JP" w:cs="Noto Sans CJK JP" w:eastAsia="Noto Sans CJK JP" w:hAnsi="Noto Sans CJK JP"/>
           <w:b/>
           <w:bCs/>
+          <w:strike/>
           <w:sz w:val="21"/>
           <w:szCs w:val="21"/>
         </w:rPr>
-        <w:t xml:space="preserve">缺少 PRAGMA busy_timeout（index.ts createDb()）</w:t>
+        <w:t xml:space="preserve">缺少 PRAGMA busy_timeout</w:t>
+      </w:r>
+      <w:r>
+        <w:rPr>
+          <w:rFonts w:ascii="Noto Sans CJK JP" w:cs="Noto Sans CJK JP" w:eastAsia="Noto Sans CJK JP" w:hAnsi="Noto Sans CJK JP"/>
+          <w:b/>
+          <w:bCs/>
+          <w:color w:val="15803d"/>
+          <w:sz w:val="21"/>
+          <w:szCs w:val="21"/>
+        </w:rPr>
+        <w:t xml:space="preserve">（index.ts createDb()）— 已修復（2026-08-21）</w:t>
       </w:r>
     </w:p>
     <w:p>
@@ -735,7 +747,7 @@
           <w:sz w:val="21"/>
           <w:szCs w:val="21"/>
         </w:rPr>
-        <w:t xml:space="preserve">建議修法：db.exec('PRAGMA busy_timeout = 5000');</w:t>
+        <w:t xml:space="preserve">已加上：db.exec('PRAGMA busy_timeout = 5000');</w:t>
       </w:r>
     </w:p>
     <w:p>
@@ -745,10 +757,11 @@
       <w:r>
         <w:rPr>
           <w:rFonts w:ascii="Noto Sans CJK JP" w:cs="Noto Sans CJK JP" w:eastAsia="Noto Sans CJK JP" w:hAnsi="Noto Sans CJK JP"/>
+          <w:color w:val="6b7280"/>
           <w:sz w:val="21"/>
           <w:szCs w:val="21"/>
         </w:rPr>
-        <w:t xml:space="preserve">在 SQLite 仍是主力儲存的這段期間，這個問題比「換資料庫」更急迫——因為現有實作連自己宣稱的行為都還沒真正兌現。</w:t>
+        <w:t xml:space="preserve">無條件套用在 file 跟 :memory: 兩種分支（不像 WAL 只在 file 分支開），並新增 test/unit/db/index.test.ts 的直接驗證（PRAGMA busy_timeout 回讀確認為 5000）。全套 397 個 microservice 測試、tsc --noEmit 皆綠燈。</w:t>
       </w:r>
     </w:p>
     <w:p>
@@ -1285,7 +1298,7 @@
                 <w:sz w:val="18"/>
                 <w:szCs w:val="18"/>
               </w:rPr>
-              <w:t xml:space="preserve">目前僅索引 parent_logical_contract_id 單欄，但實際查詢（balanceMovementStore.ts 259/276 行）是 instrument_type = ? AND parent_logical_contract_id = ? 兩個等值條件並用，複合索引可省去回表比對的動作。</w:t>
+              <w:t xml:space="preserve">目前僅索引 parent_logical_contract_id 單欄，但實際查詢（balanceMovementStore.ts 259/276/295 行——原分析漏列了 295 行的 Acceptance 查詢，同一模式共 3 個呼叫點）是 instrument_type = ? AND parent_logical_contract_id = ? 兩個等值條件並用，複合索引 (parent_logical_contract_id, instrument_type) 可省去命中索引後再回表比對 instrument_type 的動作。</w:t>
             </w:r>
           </w:p>
         </w:tc>
@@ -1422,6 +1435,78 @@
                 <w:szCs w:val="18"/>
               </w:rPr>
               <w:t xml:space="preserve">這是正確決定（SQLite 無原生 DECIMAL、REAL 有浮點誤差風險），但代表這些欄位無法在 SQL 層直接 SUM 或做數值排序；現有程式碼本來就都在 TS 層計算，一致，僅提醒未來若有人想直接對 DB 寫報表查詢須留意此限制。</w:t>
+            </w:r>
+          </w:p>
+        </w:tc>
+      </w:tr>
+      <w:tr>
+        <w:tc>
+          <w:tcPr>
+            <w:tcW w:type="dxa" w:w="2000"/>
+            <w:tcMar>
+              <w:top w:type="dxa" w:w="80"/>
+              <w:left w:type="dxa" w:w="100"/>
+              <w:bottom w:type="dxa" w:w="80"/>
+              <w:right w:type="dxa" w:w="100"/>
+            </w:tcMar>
+            <w:vAlign w:val="center"/>
+          </w:tcPr>
+          <w:p>
+            <w:r>
+              <w:rPr>
+                <w:rFonts w:ascii="Noto Sans CJK JP" w:cs="Noto Sans CJK JP" w:eastAsia="Noto Sans CJK JP" w:hAnsi="Noto Sans CJK JP"/>
+                <w:b/>
+                <w:bCs/>
+                <w:sz w:val="18"/>
+                <w:szCs w:val="18"/>
+              </w:rPr>
+              <w:t xml:space="preserve">N+1（2026-08-21 補充，原分析範圍外）</w:t>
+            </w:r>
+          </w:p>
+        </w:tc>
+        <w:tc>
+          <w:tcPr>
+            <w:tcW w:type="dxa" w:w="2200"/>
+            <w:tcMar>
+              <w:top w:type="dxa" w:w="80"/>
+              <w:left w:type="dxa" w:w="100"/>
+              <w:bottom w:type="dxa" w:w="80"/>
+              <w:right w:type="dxa" w:w="100"/>
+            </w:tcMar>
+            <w:vAlign w:val="center"/>
+          </w:tcPr>
+          <w:p>
+            <w:r>
+              <w:rPr>
+                <w:rFonts w:ascii="Noto Sans CJK JP" w:cs="Noto Sans CJK JP" w:eastAsia="Noto Sans CJK JP" w:hAnsi="Noto Sans CJK JP"/>
+                <w:sz w:val="18"/>
+                <w:szCs w:val="18"/>
+              </w:rPr>
+              <w:t xml:space="preserve">service/balanceService.ts
+listCloseEligibleContracts() /
+evaluateContractCloseEligibility()</w:t>
+            </w:r>
+          </w:p>
+        </w:tc>
+        <w:tc>
+          <w:tcPr>
+            <w:tcW w:type="dxa" w:w="5150"/>
+            <w:tcMar>
+              <w:top w:type="dxa" w:w="80"/>
+              <w:left w:type="dxa" w:w="100"/>
+              <w:bottom w:type="dxa" w:w="80"/>
+              <w:right w:type="dxa" w:w="100"/>
+            </w:tcMar>
+            <w:vAlign w:val="center"/>
+          </w:tcPr>
+          <w:p>
+            <w:r>
+              <w:rPr>
+                <w:rFonts w:ascii="Noto Sans CJK JP" w:cs="Noto Sans CJK JP" w:eastAsia="Noto Sans CJK JP" w:hAnsi="Noto Sans CJK JP"/>
+                <w:sz w:val="18"/>
+                <w:szCs w:val="18"/>
+              </w:rPr>
+              <w:t xml:space="preserve">原分析範圍只寫明 store/ 兩個檔案的查詢寫法，沒涵蓋 service 層的呼叫模式。A10/B6 Close 的 Step-1 picker 先撈最多 200 筆 ACTIVE contract，再對每一筆呼叫 evaluateContractCloseEligibility()——該函式本身又對每筆候選發 3～4 個查詢（listByContract + SG/Acceptance/[Examination] JOIN），worst case 約 1 + 200×4 ≈ 800 次查詢跑一次。現有 demo 資料量下每個查詢都吃得到索引，感受不出來，但屬於典型會隨資料量線性變差的 N+1，資料量成長後應優先處理（例如一次 JOIN 撈全部候選底下的 SG/Acceptance/Examination 事件，在記憶體裡依 parent_logical_contract_id 分組評估，取代逐筆查詢）。僅記錄，未動程式碼——這是這次追加分析發現的新項目，跟原本 P0/P1/P2 清單的其餘項目一樣屬於「不急但值得記錄」等級。</w:t>
             </w:r>
           </w:p>
         </w:tc>
@@ -1600,10 +1685,13 @@
             <w:r>
               <w:rPr>
                 <w:rFonts w:ascii="Noto Sans CJK JP" w:cs="Noto Sans CJK JP" w:eastAsia="Noto Sans CJK JP" w:hAnsi="Noto Sans CJK JP"/>
-                <w:sz w:val="18"/>
-                <w:szCs w:val="18"/>
-              </w:rPr>
-              <w:t xml:space="preserve">加一行 PRAGMA</w:t>
+                <w:b/>
+                <w:bCs/>
+                <w:color w:val="15803d"/>
+                <w:sz w:val="18"/>
+                <w:szCs w:val="18"/>
+              </w:rPr>
+              <w:t xml:space="preserve">加一行 PRAGMA — 已完成（2026-08-21）</w:t>
             </w:r>
           </w:p>
         </w:tc>
@@ -2201,28 +2289,40 @@
     </w:p>
     <w:p>
       <w:pPr>
-        <w:spacing w:after="160" w:before="0"/>
-      </w:pPr>
-      <w:r>
-        <w:rPr>
-          <w:rFonts w:ascii="Noto Sans CJK JP" w:cs="Noto Sans CJK JP" w:eastAsia="Noto Sans CJK JP" w:hAnsi="Noto Sans CJK JP"/>
+        <w:spacing w:after="160"/>
+      </w:pPr>
+      <w:r>
+        <w:rPr>
+          <w:rFonts w:ascii="Noto Sans CJK JP" w:cs="Noto Sans CJK JP" w:eastAsia="Noto Sans CJK JP" w:hAnsi="Noto Sans CJK JP"/>
+          <w:strike/>
           <w:sz w:val="21"/>
           <w:szCs w:val="21"/>
         </w:rPr>
-        <w:t xml:space="preserve">1. 立即可做：補 PRAGMA busy_timeout（P0，一行修改，行為缺口明確）。</w:t>
-      </w:r>
-    </w:p>
-    <w:p>
-      <w:pPr>
-        <w:spacing w:after="160" w:before="0"/>
-      </w:pPr>
-      <w:r>
-        <w:rPr>
-          <w:rFonts w:ascii="Noto Sans CJK JP" w:cs="Noto Sans CJK JP" w:eastAsia="Noto Sans CJK JP" w:hAnsi="Noto Sans CJK JP"/>
+        <w:t xml:space="preserve">1. 立即可做：補 PRAGMA busy_timeout</w:t>
+      </w:r>
+      <w:r>
+        <w:rPr>
+          <w:rFonts w:ascii="Noto Sans CJK JP" w:cs="Noto Sans CJK JP" w:eastAsia="Noto Sans CJK JP" w:hAnsi="Noto Sans CJK JP"/>
+          <w:b/>
+          <w:bCs/>
+          <w:color w:val="15803d"/>
           <w:sz w:val="21"/>
           <w:szCs w:val="21"/>
         </w:rPr>
-        <w:t xml:space="preserve">2. 短期可做，低風險：複合索引、LIKE 前綴比對、keyset 分頁（P2 中不涉及 schema 變更的項目）。</w:t>
+        <w:t xml:space="preserve"> — 已完成（2026-08-21）。</w:t>
+      </w:r>
+    </w:p>
+    <w:p>
+      <w:pPr>
+        <w:spacing w:after="160" w:before="0"/>
+      </w:pPr>
+      <w:r>
+        <w:rPr>
+          <w:rFonts w:ascii="Noto Sans CJK JP" w:cs="Noto Sans CJK JP" w:eastAsia="Noto Sans CJK JP" w:hAnsi="Noto Sans CJK JP"/>
+          <w:sz w:val="21"/>
+          <w:szCs w:val="21"/>
+        </w:rPr>
+        <w:t xml:space="preserve">2. 短期可做，低風險：複合索引、LIKE 前綴比對、keyset 分頁、listCloseEligibleContracts() 的 N+1（P2 中不涉及 schema 變更的項目）。</w:t>
       </w:r>
     </w:p>
     <w:p>

</xml_diff>